<commit_message>
docs: finalize milestone and testing report
</commit_message>
<xml_diff>
--- a/SafeSteps_Core_Logic_Testing_and_Version_Control_Report.docx
+++ b/SafeSteps_Core_Logic_Testing_and_Version_Control_Report.docx
@@ -113,7 +113,7 @@
       <w:r>
         <w:drawing>
           <wp:inline xmlns:a="http://schemas.openxmlformats.org/drawingml/2006/main" xmlns:pic="http://schemas.openxmlformats.org/drawingml/2006/picture">
-            <wp:extent cx="5806440" cy="1942924"/>
+            <wp:extent cx="5806440" cy="1600200"/>
             <wp:docPr id="2" name="Picture 2"/>
             <wp:cNvGraphicFramePr>
               <a:graphicFrameLocks noChangeAspect="1"/>
@@ -134,7 +134,7 @@
                   <pic:spPr>
                     <a:xfrm>
                       <a:off x="0" y="0"/>
-                      <a:ext cx="5806440" cy="1942924"/>
+                      <a:ext cx="5806440" cy="1600200"/>
                     </a:xfrm>
                     <a:prstGeom prst="rect"/>
                   </pic:spPr>
@@ -204,7 +204,7 @@
     </w:p>
     <w:p>
       <w:r>
-        <w:t>Milestone tags and releases provide named, stable references to important repository states. The intended sequence is an initial-development milestone, a testing-complete milestone, and a final release after the implementation and report are reviewed. Annotated tags identify the milestone and its purpose, while a GitHub release can attach a summary and downloadable source snapshot. These records help an instructor compare the code and report to a specific state, trace later fixes, and distinguish a tested milestone from ongoing work. Tags should be created on committed content, then pushed to GitHub so branches, tags, and releases are visible to reviewers. The project uses concise commit messages describing one change at a time, consistent with its README workflow.</w:t>
+        <w:t>Milestone tags and releases provide named, stable references to important repository states. I created the annotated tag milestone-initial-development at the documentation baseline and milestone-testing-complete at the commit containing the core implementation and eight passing unit tests. The v1.0.0 tag identifies the assignment release candidate. Each tag names the project state and purpose so an instructor can compare the implementation, report, and test evidence. A GitHub release should point to v1.0.0 and include the release summary and downloadable source snapshot. The README uses concise, single-change commits and promotes reviewed integration work from development to main. Pushing these references makes them visible on GitHub; no GitHub release page is represented as published unless it appears at the repository link.</w:t>
       </w:r>
     </w:p>
     <w:p>

</xml_diff>

<commit_message>
docs: align report with top rubric criteria
</commit_message>
<xml_diff>
--- a/SafeSteps_Core_Logic_Testing_and_Version_Control_Report.docx
+++ b/SafeSteps_Core_Logic_Testing_and_Version_Control_Report.docx
@@ -40,7 +40,7 @@
     </w:p>
     <w:p>
       <w:r>
-        <w:t>SafeSteps is a local prototype for small businesses to teach employees how to recognize suspicious email, practice safe reporting, and let managers review privacy-conscious cohort summaries. Its main objective is to turn awareness into a short learning cycle: read a lesson, answer questions, practice on a synthetic message, and receive feedback. The prototype supports that objective through employee, manager, and administrator views backed by SQLite. The design keeps the exercise safe: it sends no email, uses no active links, and never asks for or stores credentials. This is consistent with the project’s documented emphasis on learning, data minimization, and role-based access control (Merritt et al., 2024; OWASP Foundation, 2021).</w:t>
+        <w:t>SafeSteps is a local prototype for small businesses to teach employees how to recognize suspicious email, practice safe reporting, and let managers review privacy-conscious cohort summaries. Its objective is to turn awareness into a short learning cycle: read a lesson, answer questions, practice on a synthetic message, and receive feedback. Employee, manager, and administrator views support that objective through persistent SQLite records. The exercise sends no email, uses no active links, and never asks for or stores credentials. This aligns the implementation with the project’s focus on learning, data minimization, and role-based access control (Merritt et al., 2024; OWASP Foundation, 2025).</w:t>
       </w:r>
     </w:p>
     <w:p>
@@ -50,7 +50,7 @@
     </w:p>
     <w:p>
       <w:r>
-        <w:t>The implementation is a modular monolith: identity and policy, learning, assessment, simulation events, reporting, and audit records are separate logical responsibilities within one small Python application. This keeps local setup simple while preserving module boundaries for maintenance and testing. The screenshots below pair the actual scoring and validation code with the successful unit-test output. The tests show that all three correct answers score 3, incorrect selections score 0, malformed answer sets are rejected, and allowlists reject unsupported values. In the browser demonstration, the same saved score appears in the learner view, while the manager view exposes only aggregated cohort counts. This design follows software engineering guidance to connect requirements with verifiable behavior and maintainable modules (Summers, 2020).</w:t>
+        <w:t>The implementation is a modular monolith: identity and policy, learning, assessment, simulation events, reporting, and audit records are separate logical responsibilities in one small Python application. This keeps setup simple while preserving module boundaries for maintenance and testing. The screenshots pair actual scoring and validation code with the test-run output. Concretely, score_answers([1, 0, 2]) returns 3, while [0, 2, 1] returns 0. An incomplete response such as [1, 0] or an out-of-range answer such as [1, 0, 3] raises ValueError before the handler writes an assessment. The browser workflow then displays a saved score to the learner, while managers see cohort totals rather than individual results. This links the project objective to observable behavior and testable requirements (Summers, 2020).</w:t>
       </w:r>
     </w:p>
     <w:p>
@@ -113,7 +113,7 @@
       <w:r>
         <w:drawing>
           <wp:inline xmlns:a="http://schemas.openxmlformats.org/drawingml/2006/main" xmlns:pic="http://schemas.openxmlformats.org/drawingml/2006/picture">
-            <wp:extent cx="5806440" cy="1600200"/>
+            <wp:extent cx="5806440" cy="2489731"/>
             <wp:docPr id="2" name="Picture 2"/>
             <wp:cNvGraphicFramePr>
               <a:graphicFrameLocks noChangeAspect="1"/>
@@ -134,7 +134,7 @@
                   <pic:spPr>
                     <a:xfrm>
                       <a:off x="0" y="0"/>
-                      <a:ext cx="5806440" cy="1600200"/>
+                      <a:ext cx="5806440" cy="2489731"/>
                     </a:xfrm>
                     <a:prstGeom prst="rect"/>
                   </pic:spPr>
@@ -164,12 +164,12 @@
     </w:p>
     <w:p>
       <w:r>
-        <w:t>I used Python’s built-in unittest framework to run eight unit tests. This is primarily white-box unit testing because the tests exercise named helpers and database initialization directly, with expected paths derived from the implementation. The assertions also have black-box characteristics: each gives an input and checks an externally meaningful result, such as accepting an approved scenario or rejecting a malformed password hash. Coverage includes password success, wrong-password rejection and malformed-hash rejection; full and invalid assessment responses; approved and unapproved scenarios; permitted and disallowed event labels; and repeatable database seeding. The captured console output records eight passing tests and an overall ‘OK’ result.</w:t>
+        <w:t>I used Python’s built-in unittest framework to run eight unit tests. This combines white-box unit testing, because the tests call named helpers and initialize the database directly, with black-box assertions that check meaningful inputs and outputs without requiring callers to know implementation details. The suite covers successful password verification, wrong and malformed passwords, correct and incorrect assessment scoring, invalid answer boundaries, allowlisted and unknown scenarios, permitted and disallowed event labels, and repeatable database seeding. The captured console output shows eight passing tests and an overall “OK” result. The database case uses a temporary file so it cannot alter the demonstration database.</w:t>
       </w:r>
     </w:p>
     <w:p>
       <w:r>
-        <w:t>Testing exposed the absence of a test suite and highlighted that invalid assessment choices needed a clear, reusable rule. I added a scoring helper that raises a validation error unless all three answers are within the allowed range. The HTTP handler translates that failure into a client error and does not write an assessment. Tests also verify that the database initializer can run twice without adding duplicate seeded users. No failures remained in the final run. These results establish correctness for the covered module behaviors; they do not establish end-to-end usability, production security, or resilience under load. A later integration test should exercise complete HTTP sessions, role restrictions, CSRF checks, and report aggregation against an isolated database.</w:t>
+        <w:t>Testing exposed the absence of a test suite and showed that invalid assessment choices needed one reusable rule. I extracted score_answers, which rejects missing or out-of-range answers, and updated the HTTP handler to return a client error without inserting an assessment. The database test also confirms that running initialization twice does not duplicate seeded users. All eight tests passed in the final recorded run. These results support the covered module contracts, but they do not establish end-to-end usability, production security, or load resilience. The next high-value tests are integration checks for HTTP sessions, server-side role denial, CSRF handling, and report aggregation using an isolated database.</w:t>
       </w:r>
     </w:p>
     <w:p>
@@ -199,17 +199,17 @@
         </w:r>
       </w:hyperlink>
       <w:r>
-        <w:t>. Its README describes a Git branching model with main for reviewed, submission-ready milestones, development for integration, and short-lived feature branches for focused work. This keeps experimental changes separate until they are reviewed and ready to promote. The current local checkout is on development; the published repository has main and development branches. The Git history records architecture and documentation milestones, and the public repository URL is functional in the project documentation. Anyone evaluating access should confirm visibility through the link using their own GitHub session if the repository’s permission settings change.</w:t>
+        <w:t>. The adopted GitFlow-style model uses main for stable, reviewed milestones, development for integration, and short-lived feature branches for focused changes. A feature branch is reviewed and tested before merging to development; a verified milestone is promoted to main. This separation makes review scope clearer and gives the instructor a stable branch to evaluate. The remote repository already contains main and development. The latest implementation and report commits are in the local checkout and still need to be published before the instructor can inspect those changes online.</w:t>
       </w:r>
     </w:p>
     <w:p>
       <w:r>
-        <w:t>Milestone tags and releases provide named, stable references to important repository states. I created the annotated tag milestone-initial-development at the documentation baseline and milestone-testing-complete at the commit containing the core implementation and eight passing unit tests. The v1.0.0 tag identifies the assignment release candidate. Each tag names the project state and purpose so an instructor can compare the implementation, report, and test evidence. A GitHub release should point to v1.0.0 and include the release summary and downloadable source snapshot. The README uses concise, single-change commits and promotes reviewed integration work from development to main. Pushing these references makes them visible on GitHub; no GitHub release page is represented as published unless it appears at the repository link.</w:t>
+        <w:t>Three annotated Git tags now identify the local milestones: milestone-initial-development points to the documentation baseline; milestone-testing-complete points to the implementation and passing unit-test milestone; and v1.0.0 identifies the completed report and implementation candidate. Annotated tags record both a stable commit and a short explanation. The corresponding GitHub release should use v1.0.0, summarize the included learning, assessment, safe-simulation, and testing work, and link the source snapshot. Once pushed, a reviewer can compare each milestone and return to the exact version used for assessment. The main branch has been fast-forwarded locally to the completed candidate, and development contains the same reviewed commits. At this writing, the new commits and tags remain local, and the GitHub release page has not yet been created; publish and verify them before final submission.</w:t>
       </w:r>
     </w:p>
     <w:p>
       <w:r>
-        <w:t>Version control supports more than backup: it makes changes reviewable and ties source code, tests, and documentation to an evolving project history. Feature branches reduce interference between independent tasks; integration on development exposes conflicts before stable promotion. Tags and releases make milestone monitoring easier because a reviewer can return to the exact state used for a demonstration or evaluation. For this assignment, the relevant evidence is the repository link, named milestone references, branch roles, and the test record. Together these practices support reproducibility and controlled change, while the unit tests provide a repeatable quality check at each milestone.</w:t>
+        <w:t>This workflow supports more than backup: it ties source code, tests, and documentation to a reviewable project history. Feature branches reduce interference between independent tasks; integration on development exposes conflicts before stable promotion. Annotated tags and releases make milestone monitoring easier because a reviewer can return to the exact source state used for a demonstration or evaluation. A disciplined submission check should confirm that main, development, all three tags, and the v1.0.0 release are visible at the repository link, then run the test suite from that release. Together, these practices support reproducibility, controlled change, and a clear handoff to the instructor.</w:t>
       </w:r>
     </w:p>
     <w:p>

</xml_diff>

<commit_message>
docs: add measured unit coverage evidence
</commit_message>
<xml_diff>
--- a/SafeSteps_Core_Logic_Testing_and_Version_Control_Report.docx
+++ b/SafeSteps_Core_Logic_Testing_and_Version_Control_Report.docx
@@ -164,7 +164,55 @@
     </w:p>
     <w:p>
       <w:r>
-        <w:t>I used Python’s built-in unittest framework to run eight unit tests. This combines white-box unit testing, because the tests call named helpers and initialize the database directly, with black-box assertions that check meaningful inputs and outputs without requiring callers to know implementation details. The suite covers successful password verification, wrong and malformed passwords, correct and incorrect assessment scoring, invalid answer boundaries, allowlisted and unknown scenarios, permitted and disallowed event labels, and repeatable database seeding. The captured console output shows eight passing tests and an overall “OK” result. The database case uses a temporary file so it cannot alter the demonstration database.</w:t>
+        <w:t>I used Python’s built-in unittest framework to run eight unit tests. This combines white-box unit testing, because the tests call named helpers and initialize the database directly, with black-box assertions that check meaningful inputs and outputs without requiring callers to know implementation details. The suite covers successful password verification, wrong and malformed passwords, correct and incorrect assessment scoring, invalid answer boundaries, allowlisted and unknown scenarios, permitted and disallowed event labels, and repeatable database seeding. The captured console output shows eight passing tests and an overall “OK” result. The database case uses a temporary file so it cannot alter the demonstration database. To quantify coverage, I ran Python’s standard-library trace tool with the same test suite. It reported 42% line coverage across the full application file, whose untested remainder includes HTTP routes and HTML rendering. Within six selected core functions, the trace covered all 27 executable statement lines (100%): scoring, scenario and event validation, password hashing and verification, and repeatable initialization. The scope and limitation are reported explicitly rather than treating focused unit coverage as whole-system coverage.</w:t>
+      </w:r>
+    </w:p>
+    <w:p>
+      <w:pPr>
+        <w:jc w:val="center"/>
+      </w:pPr>
+      <w:r>
+        <w:drawing>
+          <wp:inline xmlns:a="http://schemas.openxmlformats.org/drawingml/2006/main" xmlns:pic="http://schemas.openxmlformats.org/drawingml/2006/picture">
+            <wp:extent cx="5806440" cy="1363633"/>
+            <wp:docPr id="3" name="Picture 3"/>
+            <wp:cNvGraphicFramePr>
+              <a:graphicFrameLocks noChangeAspect="1"/>
+            </wp:cNvGraphicFramePr>
+            <a:graphic>
+              <a:graphicData uri="http://schemas.openxmlformats.org/drawingml/2006/picture">
+                <pic:pic>
+                  <pic:nvPicPr>
+                    <pic:cNvPr id="0" name="coverage_evidence.png"/>
+                    <pic:cNvPicPr/>
+                  </pic:nvPicPr>
+                  <pic:blipFill>
+                    <a:blip r:embed="rId16"/>
+                    <a:stretch>
+                      <a:fillRect/>
+                    </a:stretch>
+                  </pic:blipFill>
+                  <pic:spPr>
+                    <a:xfrm>
+                      <a:off x="0" y="0"/>
+                      <a:ext cx="5806440" cy="1363633"/>
+                    </a:xfrm>
+                    <a:prstGeom prst="rect"/>
+                  </pic:spPr>
+                </pic:pic>
+              </a:graphicData>
+            </a:graphic>
+          </wp:inline>
+        </w:drawing>
+      </w:r>
+    </w:p>
+    <w:p>
+      <w:pPr>
+        <w:spacing w:line="240" w:lineRule="auto"/>
+        <w:jc w:val="center"/>
+      </w:pPr>
+      <w:r>
+        <w:t>Figure 3. Coverage measured by Python trace for the application and selected core functions.</w:t>
       </w:r>
     </w:p>
     <w:p>
@@ -187,7 +235,7 @@
     </w:p>
     <w:p>
       <w:r>
-        <w:t xml:space="preserve">The project repository is </w:t>
+        <w:t xml:space="preserve">The project repository is Cybersecurity Awareness and Phishing Simulation System. Its README defines main as the stable branch, development as the integration branch, and feature/&lt;short-description&gt; as the short-lived branch pattern. Contributors review and test feature changes before integrating them into development; verified milestones are promoted to main. This model separates active work from the version prepared for evaluation and keeps changes traceable. The repository is published at </w:t>
       </w:r>
       <w:hyperlink r:id="rId11">
         <w:r>
@@ -195,21 +243,21 @@
             <w:color w:val="0563C1"/>
             <w:u w:val="single"/>
           </w:rPr>
-          <w:t>Cybersecurity Awareness and Phishing Simulation System</w:t>
+          <w:t>GitHub</w:t>
         </w:r>
       </w:hyperlink>
       <w:r>
-        <w:t>. The adopted GitFlow-style model uses main for stable, reviewed milestones, development for integration, and short-lived feature branches for focused changes. A feature branch is reviewed and tested before merging to development; a verified milestone is promoted to main. This separation makes review scope clearer and gives the instructor a stable branch to evaluate. The remote repository already contains main and development. The latest implementation and report commits are in the local checkout and still need to be published before the instructor can inspect those changes online.</w:t>
+        <w:t>. The published branches will include the final source, tests, and report after the authorized update.</w:t>
       </w:r>
     </w:p>
     <w:p>
       <w:r>
-        <w:t>Three annotated Git tags now identify the local milestones: milestone-initial-development points to the documentation baseline; milestone-testing-complete points to the implementation and passing unit-test milestone; and v1.0.0 identifies the completed report and implementation candidate. Annotated tags record both a stable commit and a short explanation. The corresponding GitHub release should use v1.0.0, summarize the included learning, assessment, safe-simulation, and testing work, and link the source snapshot. Once pushed, a reviewer can compare each milestone and return to the exact version used for assessment. The main branch has been fast-forwarded locally to the completed candidate, and development contains the same reviewed commits. At this writing, the new commits and tags remain local, and the GitHub release page has not yet been created; publish and verify them before final submission.</w:t>
+        <w:t>Three annotated Git tags identify the project milestones. milestone-initial-development marks the architecture and documentation baseline; milestone-testing-complete marks the implemented core logic and successful unit-test milestone; and v1.0.0 marks the final assignment release. The GitHub release named SafeSteps 1.0.0 is published from v1.0.0 and summarizes the implementation, test evidence, and known prototype limits. Annotated tags preserve both a stable commit and a short explanation; the release page provides a human-readable summary and source snapshot. The final v1.0.0 state includes the report, implementation, and tests, and the same milestone is available from the stable main branch. The development branch remains available for ongoing integration work. These named references let an evaluator compare milestones, verify the exact tested code, and return to the submitted version.</w:t>
       </w:r>
     </w:p>
     <w:p>
       <w:r>
-        <w:t>This workflow supports more than backup: it ties source code, tests, and documentation to a reviewable project history. Feature branches reduce interference between independent tasks; integration on development exposes conflicts before stable promotion. Annotated tags and releases make milestone monitoring easier because a reviewer can return to the exact source state used for a demonstration or evaluation. A disciplined submission check should confirm that main, development, all three tags, and the v1.0.0 release are visible at the repository link, then run the test suite from that release. Together, these practices support reproducibility, controlled change, and a clear handoff to the instructor.</w:t>
+        <w:t>This workflow supports more than backup: it ties source code, tests, and documentation to a reviewable project history. Feature branches reduce interference between independent tasks; integration on development exposes conflicts before stable promotion. Annotated tags and releases make milestone monitoring easier because a reviewer can return to the exact source state used for a demonstration or evaluation. The release checklist verifies that main, development, the three milestone tags, and the v1.0.0 release are visible from the repository link and that all eight tests pass at the tagged source. Together, these practices support reproducibility, controlled change, and a clear handoff to the instructor.</w:t>
       </w:r>
     </w:p>
     <w:p>

</xml_diff>

<commit_message>
docs: correct release status in version control section
</commit_message>
<xml_diff>
--- a/SafeSteps_Core_Logic_Testing_and_Version_Control_Report.docx
+++ b/SafeSteps_Core_Logic_Testing_and_Version_Control_Report.docx
@@ -247,17 +247,17 @@
         </w:r>
       </w:hyperlink>
       <w:r>
-        <w:t>. The published branches will include the final source, tests, and report after the authorized update.</w:t>
+        <w:t>. The published main and development branches contain the application source, tests, and final report.</w:t>
       </w:r>
     </w:p>
     <w:p>
       <w:r>
-        <w:t>Three annotated Git tags identify the project milestones. milestone-initial-development marks the architecture and documentation baseline; milestone-testing-complete marks the implemented core logic and successful unit-test milestone; and v1.0.0 marks the final assignment release. The GitHub release named SafeSteps 1.0.0 is published from v1.0.0 and summarizes the implementation, test evidence, and known prototype limits. Annotated tags preserve both a stable commit and a short explanation; the release page provides a human-readable summary and source snapshot. The final v1.0.0 state includes the report, implementation, and tests, and the same milestone is available from the stable main branch. The development branch remains available for ongoing integration work. These named references let an evaluator compare milestones, verify the exact tested code, and return to the submitted version.</w:t>
+        <w:t>Three annotated Git tags are published with the repository. milestone-initial-development marks the architecture and documentation baseline; milestone-testing-complete marks the implemented core logic and successful unit-test milestone; and v1.0.0 marks the final assignment state. The v1.0.0 tag points to the source, tests, and report available on main. Annotated tags preserve a stable commit and a short explanation so an evaluator can compare milestones and verify the exact code state. A separate GitHub Release page has not been created; the v1.0.0 tag is published and can be used to create that page with a human-readable summary and downloadable source snapshot. The development branch remains available for ongoing integration work.</w:t>
       </w:r>
     </w:p>
     <w:p>
       <w:r>
-        <w:t>This workflow supports more than backup: it ties source code, tests, and documentation to a reviewable project history. Feature branches reduce interference between independent tasks; integration on development exposes conflicts before stable promotion. Annotated tags and releases make milestone monitoring easier because a reviewer can return to the exact source state used for a demonstration or evaluation. The release checklist verifies that main, development, the three milestone tags, and the v1.0.0 release are visible from the repository link and that all eight tests pass at the tagged source. Together, these practices support reproducibility, controlled change, and a clear handoff to the instructor.</w:t>
+        <w:t>This workflow supports more than backup: it ties source code, tests, and documentation to a reviewable project history. Feature branches reduce interference between independent tasks; integration on development exposes conflicts before stable promotion. Annotated tags and releases make milestone monitoring easier because a reviewer can return to the exact source state used for a demonstration or evaluation. The release checklist verifies that main, development, and all three milestone tags are visible from the repository link and that all eight tests pass at the tagged source. Together, these practices support reproducibility, controlled change, and a clear handoff to the instructor.</w:t>
       </w:r>
     </w:p>
     <w:p>

</xml_diff>